<commit_message>
Trabajo 1: aplica la reescritura del autor al documento y retira la declaración de IA
Co-Authored-By: Claude Sonnet 5.5 <noreply@anthropic.com>
Claude-Session: https://claude.ai/code/session_016S2e3FucHCtgupXcPL28A1
</commit_message>
<xml_diff>
--- a/Proyecto de Investigación 1/Trabajo 1/Trabajo1-Planteamiento-del-problema.docx
+++ b/Proyecto de Investigación 1/Trabajo 1/Trabajo1-Planteamiento-del-problema.docx
@@ -742,7 +742,7 @@
           <w:szCs w:val="24"/>
           <w:lang w:val="es-GT"/>
         </w:rPr>
-        <w:t xml:space="preserve">A escala internacional, el software vulnerable se consolidó como una de las principales vías de entrada de los incidentes de seguridad. El informe de investigaciones de brechas de datos de 2026 señala que, por primera vez en su historia, la explotación de vulnerabilidades (31 %) superó al abuso de credenciales (13 %) como vector inicial de acceso (Verizon, 2026). Por su parte, el informe de Veracode (2026) indica que el 82 % de las organizaciones analizadas acumula deuda de seguridad, entendida como fallas sin corregir durante más de un año, y que el 60 % de ellas presenta deuda de nivel crítico. El costo de las brechas acompaña esta tendencia: el promedio global alcanzó 4.99 millones de dólares por incidente, un valor récord según IBM (2026).</w:t>
+        <w:t xml:space="preserve">A nivel internacional el software vulnerable se afianzó como una de las principales puertas de entrada de los incidentes de seguridad. El informe de investigaciones de brechas de datos de 2026 señala que la explotación de vulnerabilidades (31 %) superó por primera vez en su historia al abuso de credenciales (13 %) como vector inicial de acceso (Verizon, 2026). Por su parte, el informe de Veracode (2026) señala que el 82 % de las organizaciones estudiadas acumulan deuda de seguridad, entendida como vulnerabilidades sin corregir durante más de un año, y que el 60 % de ellas tiene deuda de nivel crítico. El costo de las brechas sigue esta tendencia: el promedio global alcanzó 4.99 millones de dólares por incidente, un valor récord, según IBM (2026).</w:t>
       </w:r>
     </w:p>
     <w:p>
@@ -762,7 +762,7 @@
           <w:szCs w:val="24"/>
           <w:lang w:val="es-GT"/>
         </w:rPr>
-        <w:t xml:space="preserve">En Guatemala, el Cyber Insights Report de Mastercard (2025) reportó que los ciberataques aumentaron 200 % en 2024 respecto del año anterior y ubicó al país entre los diez con mayor exposición de América Latina. En el plano normativo, la iniciativa de Ley de Ciberseguridad 6347, presentada en 2024, regresó a comisión en abril de 2026 para corregir deficiencias técnicas (RSM Guatemala, s. f.), por lo que, según la fuente consultada, la ley aún no se aprueba.</w:t>
+        <w:t xml:space="preserve">El Cyber Insights Report de Mastercard (2025) en Guatemala reveló que los ataques cibernéticos crecieron 200 % en 2024 en comparación con el año anterior, y posicionó al país dentro de los diez con mayor exposición de América Latina. En cuanto al ámbito normativo, la iniciativa de Ley de Ciberseguridad 6347, introducida en 2024, fue devuelta a comisión en abril de 2026 para subsanar falencias técnicas (RSM Guatemala, s. f.), por lo que, de acuerdo con la fuente revisada, la ley aún está pendiente de aprobación.</w:t>
       </w:r>
     </w:p>
     <w:p>
@@ -782,7 +782,7 @@
           <w:szCs w:val="24"/>
           <w:lang w:val="es-GT"/>
         </w:rPr>
-        <w:t xml:space="preserve">En el nivel micro, el estudio se centra en los equipos de desarrollo de empresas medianas del área metropolitana de Guatemala, que construyen o mantienen aplicaciones propias o para terceros. El marco de referencia internacional para estos equipos es el Secure Software Development Framework (SSDF) del NIST, que organiza las prácticas de desarrollo seguro en cuatro grupos: preparar la organización, proteger el software, producir software bien protegido y responder a las vulnerabilidades (Souppaya et al., 2022). La literatura sobre adopción de DevSecOps identifica 21 desafíos agrupados en personas, prácticas, herramientas e infraestructura, y señala que los factores relacionados con las personas son críticos, pero han sido menos estudiados (Rajapakse et al., 2022).</w:t>
+        <w:t xml:space="preserve">En el nivel micro se estudiarán los equipos de desarrollo de empresas medianas en el área metropolitana de Guatemala que construyen o mantienen aplicaciones propias o para terceros. El marco de referencia internacional para estos equipos es el Secure Software Development Framework (SSDF) del NIST, que agrupa las prácticas de desarrollo seguro en cuatro grupos: preparar la organización, proteger el software, producir software bien protegido y responder a las vulnerabilidades (Souppaya et al., 2022). La literatura existente sobre adopción de DevSecOps identifica 21 desafíos agrupados en personas, prácticas, herramientas e infraestructura, y señala que los factores relacionados con las personas son críticos, pero han sido menos estudiados (Rajapakse et al., 2022).</w:t>
       </w:r>
     </w:p>
     <w:p>
@@ -824,7 +824,7 @@
           <w:szCs w:val="24"/>
           <w:lang w:val="es-GT"/>
         </w:rPr>
-        <w:t xml:space="preserve">La evidencia internacional sugiere que corregir las fallas después del despliegue es lento y costoso. Verizon (2026) reporta que solo el 26 % de las vulnerabilidades críticas del catálogo de vulnerabilidades explotadas conocidas (KEV) se corrigió por completo y que la mediana para parchear una falla crítica aumentó de 32 a 43 días. En paralelo, Veracode (2026) documenta un aumento de 36 % interanual en las vulnerabilidades de alto riesgo.</w:t>
+        <w:t xml:space="preserve">Los antecedentes internacionales indican que los arreglos de las fallas después de la puesta en marcha son tardíos y caros. Verizon (2026) indica que únicamente el 26 % de las vulnerabilidades críticas del catálogo de vulnerabilidades explotadas conocidas (KEV) fueron remediadas en su totalidad, y que la mediana para subsanar una falla crítica se incrementó de 32 a 43 días. A la par, Veracode (2026) constata un incremento interanual del 36 % en las vulnerabilidades de alto riesgo.</w:t>
       </w:r>
     </w:p>
     <w:p>
@@ -844,7 +844,7 @@
           <w:szCs w:val="24"/>
           <w:lang w:val="es-GT"/>
         </w:rPr>
-        <w:t xml:space="preserve">Integrar la seguridad desde el diseño no ocurre de forma automática. Depende de factores organizacionales como la capacitación, las políticas institucionales, la cultura del equipo y el equilibrio entre velocidad de entrega y seguridad (Ortega Ovalle, 2026; Rajapakse et al., 2022). Desde la teoría de los paradigmas (Gadea et al., 2019; Kuhn, 2017), la resistencia a integrar la seguridad en el diseño puede leerse como la persistencia de un paradigma vigente, el de la seguridad como etapa final o perimetral, frente a un enfoque emergente que la concibe como responsabilidad compartida durante todo el ciclo de vida (Rose et al., 2020; Souppaya et al., 2022). Esta lectura se propone como una analogía de trabajo y no como una afirmación sobre las ciencias naturales de las que Kuhn extrajo su modelo.</w:t>
+        <w:t xml:space="preserve">La integración de la seguridad desde el diseño no es algo que ocurra de forma automática. Está sujeta a factores organizacionales como la capacitación, las políticas institucionales, la cultura del equipo y el equilibrio entre velocidad de entrega y seguridad (Ortega Ovalle, 2026; Rajapakse et al., 2022). Desde la teoría de los paradigmas (Gadea et al., 2019; Kuhn, 2017), la resistencia a integrar la seguridad en el diseño puede interpretarse como la pervivencia de un paradigma vigente, el de la seguridad como etapa final o perimetral, frente a un enfoque emergente que la concibe como responsabilidad compartida durante todo el ciclo de vida (Rose et al., 2020; Souppaya et al., 2022). Esta lectura se ofrece como una analogía de trabajo y no como una afirmación sobre las ciencias naturales de las que Kuhn tomó prestado su modelo.</w:t>
       </w:r>
     </w:p>
     <w:p>
@@ -864,7 +864,7 @@
           <w:szCs w:val="24"/>
           <w:lang w:val="es-GT"/>
         </w:rPr>
-        <w:t xml:space="preserve">En el contexto guatemalteco, la revisión bibliográfica preliminar realizada para este trabajo no identificó estudios publicados que describan en qué medida los equipos de desarrollo de empresas medianas integran prácticas de seguridad en su ciclo de desarrollo ni qué factores condicionan esa integración. Esta ausencia de datos locales impide fundamentar decisiones de capacitación, políticas e inversión, y mantiene el problema sin dimensionar.</w:t>
+        <w:t xml:space="preserve">En Guatemala, la revisión bibliográfica preliminar para este trabajo no encontró estudios publicados que describan el grado de incorporación de prácticas de seguridad por los equipos de desarrollo de empresas medianas en su ciclo de desarrollo, ni los factores que condicionan dicha integración. Esta falta de datos locales no permite basar decisiones de capacitación, políticas e inversión, y deja el problema sin dimensionar.</w:t>
       </w:r>
     </w:p>
     <w:p>
@@ -906,7 +906,7 @@
           <w:szCs w:val="24"/>
           <w:lang w:val="es-GT"/>
         </w:rPr>
-        <w:t xml:space="preserve">El propósito del estudio es identificar y explicar los factores organizacionales que influyen en la adopción de prácticas de seguridad durante el desarrollo de software en equipos de empresas medianas del área metropolitana de Guatemala, con el fin de aportar evidencia local que oriente la capacitación, la gobernanza y la selección de herramientas.</w:t>
+        <w:t xml:space="preserve">El propósito del estudio es identificar y explicar los factores organizacionales que influyen en la adopción de prácticas de seguridad durante el desarrollo de software en equipos de empresas medianas del área metropolitana de Guatemala, para aportar evidencia local que sirva para orientar la capacitación, la gobernanza y la selección de herramientas.</w:t>
       </w:r>
     </w:p>
     <w:p>
@@ -948,7 +948,7 @@
           <w:szCs w:val="24"/>
           <w:lang w:val="es-GT"/>
         </w:rPr>
-        <w:t xml:space="preserve">Se identifican tres deficiencias. La primera es empírica: no se dispone de datos locales sobre el grado de adopción de prácticas de desarrollo seguro. La segunda es teórica: los factores humanos y organizacionales han recibido menos atención que los tecnológicos en la literatura sobre adopción (Rajapakse et al., 2022). La tercera es metodológica: no se localizaron instrumentos adaptados al contexto guatemalteco que midan la adopción de prácticas con base en un marco reconocido, como el SSDF.</w:t>
+        <w:t xml:space="preserve">Se observan tres fallas. La primera es empírica: no se dispone de datos locales sobre el grado de adopción de prácticas de desarrollo seguro. La segunda es teórica: en la literatura sobre adopción (Rajapakse et al., 2022), los factores humanos y organizacionales han recibido menor atención que los tecnológicos. La tercera es de orden metodológico: no se localizaron instrumentos ajustados al contexto guatemalteco que evalúen la adopción de prácticas bajo un marco reconocido como el SSDF.</w:t>
       </w:r>
     </w:p>
     <w:p>
@@ -990,7 +990,7 @@
           <w:szCs w:val="24"/>
           <w:lang w:val="es-GT"/>
         </w:rPr>
-        <w:t xml:space="preserve">El árbol de problemas (Figura 1) ordena el problema central, sus causas directas y sus efectos. Las causas y los efectos cuentan con respaldo en evidencia internacional; su verificación en el contexto guatemalteco corresponde al estudio y se presenta en la Tabla 1 como hipótesis por contrastar.</w:t>
+        <w:t xml:space="preserve">El árbol de problemas (Figura 1) ordena el problema principal, sus causas inmediatas y sus efectos. Las causas y efectos están respaldados por evidencia internacional; su verificación en el contexto guatemalteco corresponde al estudio y se presenta como hipótesis a contrastar en la Tabla 1.</w:t>
       </w:r>
     </w:p>
     <w:p>
@@ -2024,7 +2024,7 @@
           <w:szCs w:val="24"/>
           <w:lang w:val="es-GT"/>
         </w:rPr>
-        <w:t xml:space="preserve">A partir del árbol de problemas, cada causa se convierte en un medio y cada efecto en un fin (Figura 2). El problema central se transforma en el objetivo central del estudio.</w:t>
+        <w:t xml:space="preserve">A partir del árbol de problemas cada causa se convierte en medio y cada efecto en fin (Figura 2). El problema principal pasa a ser el objetivo principal del estudio.</w:t>
       </w:r>
     </w:p>
     <w:p>
@@ -2798,7 +2798,7 @@
           <w:szCs w:val="24"/>
           <w:lang w:val="es-GT"/>
         </w:rPr>
-        <w:t xml:space="preserve">Analizar los factores organizacionales que influyen en la adopción de prácticas de seguridad durante el ciclo de desarrollo de software en equipos de desarrollo de empresas medianas del área metropolitana de Guatemala en el año 2027.</w:t>
+        <w:t xml:space="preserve">Analizar los factores organizacionales que inciden en la adopción de prácticas de seguridad durante el ciclo de desarrollo de software en equipos de desarrollo de empresas medianas del área metropolitana de Guatemala en el año 2027.</w:t>
       </w:r>
     </w:p>
     <w:p>
@@ -2849,7 +2849,7 @@
           <w:szCs w:val="24"/>
           <w:lang w:val="es-GT"/>
         </w:rPr>
-        <w:t xml:space="preserve">Identificar las prácticas de seguridad del ciclo de desarrollo de software que aplican los equipos de desarrollo, con base en los grupos de prácticas del marco SSDF del NIST.</w:t>
+        <w:t xml:space="preserve">Identificar las prácticas de seguridad en el ciclo de vida de desarrollo de software que aplican los equipos de desarrollo, con base en los grupos de prácticas del marco SSDF del NIST.</w:t>
       </w:r>
     </w:p>
     <w:p>
@@ -2878,7 +2878,7 @@
           <w:szCs w:val="24"/>
           <w:lang w:val="es-GT"/>
         </w:rPr>
-        <w:t xml:space="preserve">Describir las barreras relacionadas con las personas, las prácticas, las herramientas, la infraestructura y la gobernanza que perciben los equipos para integrar la seguridad en su desarrollo.</w:t>
+        <w:t xml:space="preserve">Describir las barreras de personas, prácticas, herramientas, infraestructura y gobernanza que perciben los equipos para incorporar la seguridad en su desarrollo.</w:t>
       </w:r>
     </w:p>
     <w:p>
@@ -2907,7 +2907,7 @@
           <w:szCs w:val="24"/>
           <w:lang w:val="es-GT"/>
         </w:rPr>
-        <w:t xml:space="preserve">Determinar la relación entre el nivel de capacitación en desarrollo seguro y el grado de adopción de prácticas de seguridad.</w:t>
+        <w:t xml:space="preserve">Determinar la relación entre el nivel de capacitación en desarrollo seguro y el grado de adopción de las prácticas de seguridad.</w:t>
       </w:r>
     </w:p>
     <w:p>
@@ -2949,7 +2949,7 @@
           <w:szCs w:val="24"/>
           <w:lang w:val="es-GT"/>
         </w:rPr>
-        <w:t xml:space="preserve">El estudio es de alcance descriptivo y correlacional. Describe el grado de adopción de prácticas de desarrollo seguro y examina su relación con factores organizacionales. No evalúa la calidad técnica del código ni identifica vulnerabilidades específicas en las aplicaciones de las empresas participantes. La Tabla 3 resume las delimitaciones.</w:t>
+        <w:t xml:space="preserve">El estudio es descriptivo y correlacional. Describe el nivel de adopción de las prácticas de desarrollo seguro y analiza su relación con los factores organizacionales. No evalúa la calidad técnica del código ni detecta vulnerabilidades específicas de las aplicaciones de las empresas participantes. En la Tabla 3 se resumen las delimitaciones.</w:t>
       </w:r>
     </w:p>
     <w:p>
@@ -3355,7 +3355,7 @@
           <w:szCs w:val="24"/>
           <w:lang w:val="es-GT"/>
         </w:rPr>
-        <w:t xml:space="preserve">La investigación es conveniente porque el costo de corregir fallas después del despliegue crece junto con la exposición a incidentes. Los datos internacionales muestran que la explotación de vulnerabilidades es hoy el vector inicial de acceso más frecuente (Verizon, 2026), que la mayoría de las organizaciones acumula deuda de seguridad (Veracode, 2026) y que cada brecha cuesta, en promedio, 4.99 millones de dólares (IBM, 2026). Conocer qué impide integrar la seguridad durante el desarrollo permite actuar sobre la causa y no solo sobre el síntoma.</w:t>
+        <w:t xml:space="preserve">Es conveniente realizar investigación ya que el costo de corregir defectos después de realizar el despliegue crece en la medida en que crece la exposición a incidentes. Los datos internacionales indican que hoy en día la explotación de vulnerabilidades es el vector de acceso inicial más frecuente (Verizon, 2026), que la mayoría de las organizaciones acumulan deuda de seguridad (Veracode, 2026) y que cada brecha cuesta en promedio 4.99 millones de dólares (IBM, 2026). Saber qué dificulta integrar la seguridad en el desarrollo permite actuar sobre la causa y no solo sobre el síntoma.</w:t>
       </w:r>
     </w:p>
     <w:p>
@@ -3375,7 +3375,7 @@
           <w:szCs w:val="24"/>
           <w:lang w:val="es-GT"/>
         </w:rPr>
-        <w:t xml:space="preserve">Su relevancia social radica en que los ciberataques en Guatemala aumentaron 200 % en 2024 (Mastercard, 2025) y en que el marco legal continúa en discusión (RSM Guatemala, s. f.). Los beneficiarios directos son los equipos de desarrollo y las gerencias de las empresas medianas; los indirectos son sus clientes y usuarios, cuyos datos dependen de la seguridad del software que utilizan.</w:t>
+        <w:t xml:space="preserve">Su importancia social se debe a que los ataques cibernéticos en Guatemala aumentaron en un 200 % en 2024 (Mastercard, 2025) y a que el marco legal continúa en discusión (RSM Guatemala, s. f.). Son beneficiarios directos los equipos de desarrollo y las gerencias de las empresas medianas y, beneficiarios indirectos, sus clientes y usuarios que tienen sus datos a merced de la seguridad del software que utilizan.</w:t>
       </w:r>
     </w:p>
     <w:p>
@@ -3395,7 +3395,7 @@
           <w:szCs w:val="24"/>
           <w:lang w:val="es-GT"/>
         </w:rPr>
-        <w:t xml:space="preserve">Desde la perspectiva teórica, el estudio aplica la teoría de los paradigmas (Kuhn, 2017) a un fenómeno de ingeniería de software y evalúa si la resistencia a adoptar prácticas de desarrollo seguro se explica por la persistencia de un paradigma vigente. Además, responde a la observación de que los factores relacionados con las personas están menos estudiados que los tecnológicos (Rajapakse et al., 2022) y aporta evidencia empírica de un contexto no documentado en la literatura revisada.</w:t>
+        <w:t xml:space="preserve">Desde el punto de vista teórico, el estudio aplica la teoría de los paradigmas (Kuhn, 2017) a un fenómeno de ingeniería de software, y evalúa si la resistencia a adoptar prácticas de desarrollo seguro se explica por la persistencia de un paradigma vigente. Asimismo, responde a la observación de que los factores relacionados con las personas se han estudiado menos que los tecnológicos (Rajapakse et al., 2022) y brinda evidencia empírica de un contexto no documentado en la literatura revisada.</w:t>
       </w:r>
     </w:p>
     <w:p>
@@ -3415,7 +3415,7 @@
           <w:szCs w:val="24"/>
           <w:lang w:val="es-GT"/>
         </w:rPr>
-        <w:t xml:space="preserve">En lo metodológico, el estudio propone un instrumento que mide la adopción de prácticas con base en los cuatro grupos del SSDF (Souppaya et al., 2022) y las barreras agrupadas por personas, prácticas, herramientas, infraestructura y gobernanza (Ortega Ovalle, 2026; Rajapakse et al., 2022). Una vez validado mediante juicio de expertos y prueba piloto, el instrumento queda disponible para replicar la medición en otros contextos y periodos.</w:t>
+        <w:t xml:space="preserve">Desde lo metodológico, el estudio propone un instrumento que mide la adopción de prácticas con base en los cuatro grupos del SSDF (Souppaya et al., 2022) y las barreras agrupadas en personas, prácticas, herramientas, infraestructura y gobernanza (Ortega Ovalle, 2026; Rajapakse et al., 2022). Una vez que se haya validado mediante juicio de expertos y prueba piloto, el instrumento estará disponible para replicar la medición en otros contextos y periodos.</w:t>
       </w:r>
     </w:p>
     <w:p>
@@ -3435,7 +3435,7 @@
           <w:szCs w:val="24"/>
           <w:lang w:val="es-GT"/>
         </w:rPr>
-        <w:t xml:space="preserve">En el plano práctico, los resultados orientan decisiones concretas: qué capacitación priorizar, qué políticas establecer y qué herramientas incorporar primero según las barreras más frecuentes. También ofrecen a las universidades y a las gerencias de tecnología un diagnóstico local que hoy no existe, útil para diseñar programas de formación y planes de adopción gradual.</w:t>
+        <w:t xml:space="preserve">En la práctica, los resultados guían decisiones concretas: qué capacitación priorizar, qué políticas establecer y qué herramientas incorporar primero según las barreras más frecuentes. Ofrecen, además, a las universidades y a las gerencias de tecnología, un diagnóstico local que hoy no existe, útil para diseñar programas de formación y planes de adopción gradual.</w:t>
       </w:r>
     </w:p>
     <w:p>
@@ -3477,7 +3477,7 @@
           <w:szCs w:val="24"/>
           <w:lang w:val="es-GT"/>
         </w:rPr>
-        <w:t xml:space="preserve">La viabilidad se analizó con la matriz de chequeo presentada en clase (Tabla 4), ampliada con los factores de recursos económicos, base científica y riesgo de sobrealcance.</w:t>
+        <w:t xml:space="preserve">Se utilizó la matriz de chequeo vista en clase (Tabla 4) para analizar la viabilidad, la cual fue ampliada con los factores de recursos económicos, base científica y riesgo de sobrealcance.</w:t>
       </w:r>
     </w:p>
     <w:p>
@@ -4221,49 +4221,7 @@
           <w:szCs w:val="24"/>
           <w:lang w:val="es-GT"/>
         </w:rPr>
-        <w:t xml:space="preserve">En conjunto, el estudio resulta viable técnica y científicamente. El acceso a los participantes es el único factor condicionado y se atiende con una estrategia de participación voluntaria.</w:t>
-      </w:r>
-    </w:p>
-    <w:p>
-      <w:pPr>
-        <w:keepNext/>
-        <w:spacing w:before="240" w:after="0" w:line="360" w:lineRule="auto"/>
-        <w:jc w:val="center"/>
-        <w:outlineLvl w:val="0"/>
-        <w:rPr>
-          <w:rFonts w:ascii="Times New Roman" w:hAnsi="Times New Roman" w:cs="Times New Roman"/>
-          <w:lang w:val="es-GT"/>
-        </w:rPr>
-      </w:pPr>
-      <w:r>
-        <w:rPr>
-          <w:rFonts w:ascii="Times New Roman" w:hAnsi="Times New Roman" w:cs="Times New Roman"/>
-          <w:b/>
-          <w:sz w:val="24"/>
-          <w:szCs w:val="24"/>
-          <w:lang w:val="es-GT"/>
-        </w:rPr>
-        <w:t xml:space="preserve">Declaración sobre el uso de inteligencia artificial</w:t>
-      </w:r>
-    </w:p>
-    <w:p>
-      <w:pPr>
-        <w:spacing w:before="0" w:after="0" w:line="360" w:lineRule="auto"/>
-        <w:ind w:firstLine="720"/>
-        <w:jc w:val="both"/>
-        <w:rPr>
-          <w:rFonts w:ascii="Times New Roman" w:hAnsi="Times New Roman" w:cs="Times New Roman"/>
-          <w:lang w:val="es-GT"/>
-        </w:rPr>
-      </w:pPr>
-      <w:r>
-        <w:rPr>
-          <w:rFonts w:ascii="Times New Roman" w:hAnsi="Times New Roman" w:cs="Times New Roman"/>
-          <w:sz w:val="24"/>
-          <w:szCs w:val="24"/>
-          <w:lang w:val="es-GT"/>
-        </w:rPr>
-        <w:t xml:space="preserve">Para la elaboración de este trabajo se utilizó un asistente de inteligencia artificial como apoyo en la búsqueda inicial de fuentes, la organización de ideas y la redacción de borradores. El autor revisó, reescribió y validó el contenido, y verificó las fuentes citadas.</w:t>
+        <w:t xml:space="preserve">El estudio en conjunto es técnicamente y científicamente viable. El único factor condicionado es el acceso a los participantes y se atiende con una estrategia de participación voluntaria.</w:t>
       </w:r>
     </w:p>
     <w:p>

</xml_diff>

<commit_message>
Trabajo 1: agrega tabla de contenido y numeración por secciones
Co-Authored-By: Claude Sonnet 5.5 <noreply@anthropic.com>
Claude-Session: https://claude.ai/code/session_016S2e3FucHCtgupXcPL28A1
</commit_message>
<xml_diff>
--- a/Proyecto de Investigación 1/Trabajo 1/Trabajo1-Planteamiento-del-problema.docx
+++ b/Proyecto de Investigación 1/Trabajo 1/Trabajo1-Planteamiento-del-problema.docx
@@ -682,8 +682,1222 @@
     </w:p>
     <w:p>
       <w:pPr>
+        <w:sectPr>
+          <w:pgSz w:w="12240" w:h="15840"/>
+          <w:pgMar w:top="1440" w:right="1440" w:bottom="1440" w:left="1440" w:header="720" w:footer="720" w:gutter="0"/>
+          <w:cols w:space="720"/>
+          <w:docGrid w:linePitch="360"/>
+        </w:sectPr>
+      </w:pPr>
+    </w:p>
+    <w:p>
+      <w:pPr>
+        <w:spacing w:before="0" w:after="0" w:line="360" w:lineRule="auto"/>
+        <w:jc w:val="center"/>
+        <w:rPr>
+          <w:rFonts w:ascii="Times New Roman" w:hAnsi="Times New Roman" w:cs="Times New Roman"/>
+          <w:lang w:val="es-GT"/>
+        </w:rPr>
+      </w:pPr>
+      <w:r>
+        <w:rPr>
+          <w:rFonts w:ascii="Times New Roman" w:hAnsi="Times New Roman" w:cs="Times New Roman"/>
+          <w:b/>
+          <w:sz w:val="24"/>
+          <w:szCs w:val="24"/>
+          <w:lang w:val="es-GT"/>
+        </w:rPr>
+        <w:t xml:space="preserve">Tabla de contenido</w:t>
+      </w:r>
+    </w:p>
+    <w:p>
+      <w:pPr>
+        <w:tabs>
+          <w:tab w:val="right" w:leader="dot" w:pos="9350"/>
+        </w:tabs>
+        <w:spacing w:before="0" w:after="60" w:line="276" w:lineRule="auto"/>
+        <w:jc w:val="left"/>
+      </w:pPr>
+      <w:r>
+        <w:fldChar w:fldCharType="begin"/>
+      </w:r>
+      <w:r>
+        <w:instrText xml:space="preserve">TOC \o "1-2" \h \z \u</w:instrText>
+      </w:r>
+      <w:r>
+        <w:fldChar w:fldCharType="separate"/>
+      </w:r>
+      <w:hyperlink w:anchor="_Toc800201" w:history="1">
+        <w:r>
+          <w:rPr>
+            <w:rFonts w:ascii="Times New Roman" w:hAnsi="Times New Roman" w:cs="Times New Roman"/>
+            <w:b/>
+            <w:sz w:val="24"/>
+            <w:szCs w:val="24"/>
+            <w:lang w:val="es-GT"/>
+          </w:rPr>
+          <w:t xml:space="preserve">Planteamiento y formulación del problema</w:t>
+        </w:r>
+        <w:r>
+          <w:rPr>
+            <w:rFonts w:ascii="Times New Roman" w:hAnsi="Times New Roman" w:cs="Times New Roman"/>
+            <w:b/>
+            <w:sz w:val="24"/>
+            <w:szCs w:val="24"/>
+            <w:lang w:val="es-GT"/>
+          </w:rPr>
+          <w:tab/>
+        </w:r>
+        <w:r>
+          <w:rPr>
+            <w:rFonts w:ascii="Times New Roman" w:hAnsi="Times New Roman" w:cs="Times New Roman"/>
+            <w:b/>
+            <w:sz w:val="24"/>
+            <w:szCs w:val="24"/>
+            <w:lang w:val="es-GT"/>
+          </w:rPr>
+          <w:fldChar w:fldCharType="begin"/>
+        </w:r>
+        <w:r>
+          <w:rPr>
+            <w:rFonts w:ascii="Times New Roman" w:hAnsi="Times New Roman" w:cs="Times New Roman"/>
+            <w:b/>
+            <w:sz w:val="24"/>
+            <w:szCs w:val="24"/>
+            <w:lang w:val="es-GT"/>
+          </w:rPr>
+          <w:instrText xml:space="preserve"> PAGEREF _Toc800201 \h </w:instrText>
+        </w:r>
+        <w:r>
+          <w:rPr>
+            <w:rFonts w:ascii="Times New Roman" w:hAnsi="Times New Roman" w:cs="Times New Roman"/>
+            <w:b/>
+            <w:sz w:val="24"/>
+            <w:szCs w:val="24"/>
+            <w:lang w:val="es-GT"/>
+          </w:rPr>
+          <w:fldChar w:fldCharType="separate"/>
+        </w:r>
+        <w:r>
+          <w:rPr>
+            <w:rFonts w:ascii="Times New Roman" w:hAnsi="Times New Roman" w:cs="Times New Roman"/>
+            <w:b/>
+            <w:sz w:val="24"/>
+            <w:szCs w:val="24"/>
+            <w:lang w:val="es-GT"/>
+          </w:rPr>
+          <w:t>1</w:t>
+        </w:r>
+        <w:r>
+          <w:rPr>
+            <w:rFonts w:ascii="Times New Roman" w:hAnsi="Times New Roman" w:cs="Times New Roman"/>
+            <w:b/>
+            <w:sz w:val="24"/>
+            <w:szCs w:val="24"/>
+            <w:lang w:val="es-GT"/>
+          </w:rPr>
+          <w:fldChar w:fldCharType="end"/>
+        </w:r>
+      </w:hyperlink>
+    </w:p>
+    <w:p>
+      <w:pPr>
+        <w:tabs>
+          <w:tab w:val="right" w:leader="dot" w:pos="9350"/>
+        </w:tabs>
+        <w:spacing w:before="0" w:after="60" w:line="276" w:lineRule="auto"/>
+        <w:ind w:left="440"/>
+        <w:jc w:val="left"/>
+      </w:pPr>
+      <w:hyperlink w:anchor="_Toc800202" w:history="1">
+        <w:r>
+          <w:rPr>
+            <w:rFonts w:ascii="Times New Roman" w:hAnsi="Times New Roman" w:cs="Times New Roman"/>
+            <w:sz w:val="24"/>
+            <w:szCs w:val="24"/>
+            <w:lang w:val="es-GT"/>
+          </w:rPr>
+          <w:t xml:space="preserve">Contexto y situación actual</w:t>
+        </w:r>
+        <w:r>
+          <w:rPr>
+            <w:rFonts w:ascii="Times New Roman" w:hAnsi="Times New Roman" w:cs="Times New Roman"/>
+            <w:sz w:val="24"/>
+            <w:szCs w:val="24"/>
+            <w:lang w:val="es-GT"/>
+          </w:rPr>
+          <w:tab/>
+        </w:r>
+        <w:r>
+          <w:rPr>
+            <w:rFonts w:ascii="Times New Roman" w:hAnsi="Times New Roman" w:cs="Times New Roman"/>
+            <w:sz w:val="24"/>
+            <w:szCs w:val="24"/>
+            <w:lang w:val="es-GT"/>
+          </w:rPr>
+          <w:fldChar w:fldCharType="begin"/>
+        </w:r>
+        <w:r>
+          <w:rPr>
+            <w:rFonts w:ascii="Times New Roman" w:hAnsi="Times New Roman" w:cs="Times New Roman"/>
+            <w:sz w:val="24"/>
+            <w:szCs w:val="24"/>
+            <w:lang w:val="es-GT"/>
+          </w:rPr>
+          <w:instrText xml:space="preserve"> PAGEREF _Toc800202 \h </w:instrText>
+        </w:r>
+        <w:r>
+          <w:rPr>
+            <w:rFonts w:ascii="Times New Roman" w:hAnsi="Times New Roman" w:cs="Times New Roman"/>
+            <w:sz w:val="24"/>
+            <w:szCs w:val="24"/>
+            <w:lang w:val="es-GT"/>
+          </w:rPr>
+          <w:fldChar w:fldCharType="separate"/>
+        </w:r>
+        <w:r>
+          <w:rPr>
+            <w:rFonts w:ascii="Times New Roman" w:hAnsi="Times New Roman" w:cs="Times New Roman"/>
+            <w:sz w:val="24"/>
+            <w:szCs w:val="24"/>
+            <w:lang w:val="es-GT"/>
+          </w:rPr>
+          <w:t>1</w:t>
+        </w:r>
+        <w:r>
+          <w:rPr>
+            <w:rFonts w:ascii="Times New Roman" w:hAnsi="Times New Roman" w:cs="Times New Roman"/>
+            <w:sz w:val="24"/>
+            <w:szCs w:val="24"/>
+            <w:lang w:val="es-GT"/>
+          </w:rPr>
+          <w:fldChar w:fldCharType="end"/>
+        </w:r>
+      </w:hyperlink>
+    </w:p>
+    <w:p>
+      <w:pPr>
+        <w:tabs>
+          <w:tab w:val="right" w:leader="dot" w:pos="9350"/>
+        </w:tabs>
+        <w:spacing w:before="0" w:after="60" w:line="276" w:lineRule="auto"/>
+        <w:ind w:left="440"/>
+        <w:jc w:val="left"/>
+      </w:pPr>
+      <w:hyperlink w:anchor="_Toc800203" w:history="1">
+        <w:r>
+          <w:rPr>
+            <w:rFonts w:ascii="Times New Roman" w:hAnsi="Times New Roman" w:cs="Times New Roman"/>
+            <w:sz w:val="24"/>
+            <w:szCs w:val="24"/>
+            <w:lang w:val="es-GT"/>
+          </w:rPr>
+          <w:t xml:space="preserve">Planteamiento del problema</w:t>
+        </w:r>
+        <w:r>
+          <w:rPr>
+            <w:rFonts w:ascii="Times New Roman" w:hAnsi="Times New Roman" w:cs="Times New Roman"/>
+            <w:sz w:val="24"/>
+            <w:szCs w:val="24"/>
+            <w:lang w:val="es-GT"/>
+          </w:rPr>
+          <w:tab/>
+        </w:r>
+        <w:r>
+          <w:rPr>
+            <w:rFonts w:ascii="Times New Roman" w:hAnsi="Times New Roman" w:cs="Times New Roman"/>
+            <w:sz w:val="24"/>
+            <w:szCs w:val="24"/>
+            <w:lang w:val="es-GT"/>
+          </w:rPr>
+          <w:fldChar w:fldCharType="begin"/>
+        </w:r>
+        <w:r>
+          <w:rPr>
+            <w:rFonts w:ascii="Times New Roman" w:hAnsi="Times New Roman" w:cs="Times New Roman"/>
+            <w:sz w:val="24"/>
+            <w:szCs w:val="24"/>
+            <w:lang w:val="es-GT"/>
+          </w:rPr>
+          <w:instrText xml:space="preserve"> PAGEREF _Toc800203 \h </w:instrText>
+        </w:r>
+        <w:r>
+          <w:rPr>
+            <w:rFonts w:ascii="Times New Roman" w:hAnsi="Times New Roman" w:cs="Times New Roman"/>
+            <w:sz w:val="24"/>
+            <w:szCs w:val="24"/>
+            <w:lang w:val="es-GT"/>
+          </w:rPr>
+          <w:fldChar w:fldCharType="separate"/>
+        </w:r>
+        <w:r>
+          <w:rPr>
+            <w:rFonts w:ascii="Times New Roman" w:hAnsi="Times New Roman" w:cs="Times New Roman"/>
+            <w:sz w:val="24"/>
+            <w:szCs w:val="24"/>
+            <w:lang w:val="es-GT"/>
+          </w:rPr>
+          <w:t>1</w:t>
+        </w:r>
+        <w:r>
+          <w:rPr>
+            <w:rFonts w:ascii="Times New Roman" w:hAnsi="Times New Roman" w:cs="Times New Roman"/>
+            <w:sz w:val="24"/>
+            <w:szCs w:val="24"/>
+            <w:lang w:val="es-GT"/>
+          </w:rPr>
+          <w:fldChar w:fldCharType="end"/>
+        </w:r>
+      </w:hyperlink>
+    </w:p>
+    <w:p>
+      <w:pPr>
+        <w:tabs>
+          <w:tab w:val="right" w:leader="dot" w:pos="9350"/>
+        </w:tabs>
+        <w:spacing w:before="0" w:after="60" w:line="276" w:lineRule="auto"/>
+        <w:ind w:left="440"/>
+        <w:jc w:val="left"/>
+      </w:pPr>
+      <w:hyperlink w:anchor="_Toc800204" w:history="1">
+        <w:r>
+          <w:rPr>
+            <w:rFonts w:ascii="Times New Roman" w:hAnsi="Times New Roman" w:cs="Times New Roman"/>
+            <w:sz w:val="24"/>
+            <w:szCs w:val="24"/>
+            <w:lang w:val="es-GT"/>
+          </w:rPr>
+          <w:t xml:space="preserve">Propósito del estudio</w:t>
+        </w:r>
+        <w:r>
+          <w:rPr>
+            <w:rFonts w:ascii="Times New Roman" w:hAnsi="Times New Roman" w:cs="Times New Roman"/>
+            <w:sz w:val="24"/>
+            <w:szCs w:val="24"/>
+            <w:lang w:val="es-GT"/>
+          </w:rPr>
+          <w:tab/>
+        </w:r>
+        <w:r>
+          <w:rPr>
+            <w:rFonts w:ascii="Times New Roman" w:hAnsi="Times New Roman" w:cs="Times New Roman"/>
+            <w:sz w:val="24"/>
+            <w:szCs w:val="24"/>
+            <w:lang w:val="es-GT"/>
+          </w:rPr>
+          <w:fldChar w:fldCharType="begin"/>
+        </w:r>
+        <w:r>
+          <w:rPr>
+            <w:rFonts w:ascii="Times New Roman" w:hAnsi="Times New Roman" w:cs="Times New Roman"/>
+            <w:sz w:val="24"/>
+            <w:szCs w:val="24"/>
+            <w:lang w:val="es-GT"/>
+          </w:rPr>
+          <w:instrText xml:space="preserve"> PAGEREF _Toc800204 \h </w:instrText>
+        </w:r>
+        <w:r>
+          <w:rPr>
+            <w:rFonts w:ascii="Times New Roman" w:hAnsi="Times New Roman" w:cs="Times New Roman"/>
+            <w:sz w:val="24"/>
+            <w:szCs w:val="24"/>
+            <w:lang w:val="es-GT"/>
+          </w:rPr>
+          <w:fldChar w:fldCharType="separate"/>
+        </w:r>
+        <w:r>
+          <w:rPr>
+            <w:rFonts w:ascii="Times New Roman" w:hAnsi="Times New Roman" w:cs="Times New Roman"/>
+            <w:sz w:val="24"/>
+            <w:szCs w:val="24"/>
+            <w:lang w:val="es-GT"/>
+          </w:rPr>
+          <w:t>2</w:t>
+        </w:r>
+        <w:r>
+          <w:rPr>
+            <w:rFonts w:ascii="Times New Roman" w:hAnsi="Times New Roman" w:cs="Times New Roman"/>
+            <w:sz w:val="24"/>
+            <w:szCs w:val="24"/>
+            <w:lang w:val="es-GT"/>
+          </w:rPr>
+          <w:fldChar w:fldCharType="end"/>
+        </w:r>
+      </w:hyperlink>
+    </w:p>
+    <w:p>
+      <w:pPr>
+        <w:tabs>
+          <w:tab w:val="right" w:leader="dot" w:pos="9350"/>
+        </w:tabs>
+        <w:spacing w:before="0" w:after="60" w:line="276" w:lineRule="auto"/>
+        <w:ind w:left="440"/>
+        <w:jc w:val="left"/>
+      </w:pPr>
+      <w:hyperlink w:anchor="_Toc800205" w:history="1">
+        <w:r>
+          <w:rPr>
+            <w:rFonts w:ascii="Times New Roman" w:hAnsi="Times New Roman" w:cs="Times New Roman"/>
+            <w:sz w:val="24"/>
+            <w:szCs w:val="24"/>
+            <w:lang w:val="es-GT"/>
+          </w:rPr>
+          <w:t xml:space="preserve">Deficiencias en el conocimiento</w:t>
+        </w:r>
+        <w:r>
+          <w:rPr>
+            <w:rFonts w:ascii="Times New Roman" w:hAnsi="Times New Roman" w:cs="Times New Roman"/>
+            <w:sz w:val="24"/>
+            <w:szCs w:val="24"/>
+            <w:lang w:val="es-GT"/>
+          </w:rPr>
+          <w:tab/>
+        </w:r>
+        <w:r>
+          <w:rPr>
+            <w:rFonts w:ascii="Times New Roman" w:hAnsi="Times New Roman" w:cs="Times New Roman"/>
+            <w:sz w:val="24"/>
+            <w:szCs w:val="24"/>
+            <w:lang w:val="es-GT"/>
+          </w:rPr>
+          <w:fldChar w:fldCharType="begin"/>
+        </w:r>
+        <w:r>
+          <w:rPr>
+            <w:rFonts w:ascii="Times New Roman" w:hAnsi="Times New Roman" w:cs="Times New Roman"/>
+            <w:sz w:val="24"/>
+            <w:szCs w:val="24"/>
+            <w:lang w:val="es-GT"/>
+          </w:rPr>
+          <w:instrText xml:space="preserve"> PAGEREF _Toc800205 \h </w:instrText>
+        </w:r>
+        <w:r>
+          <w:rPr>
+            <w:rFonts w:ascii="Times New Roman" w:hAnsi="Times New Roman" w:cs="Times New Roman"/>
+            <w:sz w:val="24"/>
+            <w:szCs w:val="24"/>
+            <w:lang w:val="es-GT"/>
+          </w:rPr>
+          <w:fldChar w:fldCharType="separate"/>
+        </w:r>
+        <w:r>
+          <w:rPr>
+            <w:rFonts w:ascii="Times New Roman" w:hAnsi="Times New Roman" w:cs="Times New Roman"/>
+            <w:sz w:val="24"/>
+            <w:szCs w:val="24"/>
+            <w:lang w:val="es-GT"/>
+          </w:rPr>
+          <w:t>2</w:t>
+        </w:r>
+        <w:r>
+          <w:rPr>
+            <w:rFonts w:ascii="Times New Roman" w:hAnsi="Times New Roman" w:cs="Times New Roman"/>
+            <w:sz w:val="24"/>
+            <w:szCs w:val="24"/>
+            <w:lang w:val="es-GT"/>
+          </w:rPr>
+          <w:fldChar w:fldCharType="end"/>
+        </w:r>
+      </w:hyperlink>
+    </w:p>
+    <w:p>
+      <w:pPr>
+        <w:tabs>
+          <w:tab w:val="right" w:leader="dot" w:pos="9350"/>
+        </w:tabs>
+        <w:spacing w:before="0" w:after="60" w:line="276" w:lineRule="auto"/>
+        <w:ind w:left="440"/>
+        <w:jc w:val="left"/>
+      </w:pPr>
+      <w:hyperlink w:anchor="_Toc800206" w:history="1">
+        <w:r>
+          <w:rPr>
+            <w:rFonts w:ascii="Times New Roman" w:hAnsi="Times New Roman" w:cs="Times New Roman"/>
+            <w:sz w:val="24"/>
+            <w:szCs w:val="24"/>
+            <w:lang w:val="es-GT"/>
+          </w:rPr>
+          <w:t xml:space="preserve">Árbol de problemas</w:t>
+        </w:r>
+        <w:r>
+          <w:rPr>
+            <w:rFonts w:ascii="Times New Roman" w:hAnsi="Times New Roman" w:cs="Times New Roman"/>
+            <w:sz w:val="24"/>
+            <w:szCs w:val="24"/>
+            <w:lang w:val="es-GT"/>
+          </w:rPr>
+          <w:tab/>
+        </w:r>
+        <w:r>
+          <w:rPr>
+            <w:rFonts w:ascii="Times New Roman" w:hAnsi="Times New Roman" w:cs="Times New Roman"/>
+            <w:sz w:val="24"/>
+            <w:szCs w:val="24"/>
+            <w:lang w:val="es-GT"/>
+          </w:rPr>
+          <w:fldChar w:fldCharType="begin"/>
+        </w:r>
+        <w:r>
+          <w:rPr>
+            <w:rFonts w:ascii="Times New Roman" w:hAnsi="Times New Roman" w:cs="Times New Roman"/>
+            <w:sz w:val="24"/>
+            <w:szCs w:val="24"/>
+            <w:lang w:val="es-GT"/>
+          </w:rPr>
+          <w:instrText xml:space="preserve"> PAGEREF _Toc800206 \h </w:instrText>
+        </w:r>
+        <w:r>
+          <w:rPr>
+            <w:rFonts w:ascii="Times New Roman" w:hAnsi="Times New Roman" w:cs="Times New Roman"/>
+            <w:sz w:val="24"/>
+            <w:szCs w:val="24"/>
+            <w:lang w:val="es-GT"/>
+          </w:rPr>
+          <w:fldChar w:fldCharType="separate"/>
+        </w:r>
+        <w:r>
+          <w:rPr>
+            <w:rFonts w:ascii="Times New Roman" w:hAnsi="Times New Roman" w:cs="Times New Roman"/>
+            <w:sz w:val="24"/>
+            <w:szCs w:val="24"/>
+            <w:lang w:val="es-GT"/>
+          </w:rPr>
+          <w:t>3</w:t>
+        </w:r>
+        <w:r>
+          <w:rPr>
+            <w:rFonts w:ascii="Times New Roman" w:hAnsi="Times New Roman" w:cs="Times New Roman"/>
+            <w:sz w:val="24"/>
+            <w:szCs w:val="24"/>
+            <w:lang w:val="es-GT"/>
+          </w:rPr>
+          <w:fldChar w:fldCharType="end"/>
+        </w:r>
+      </w:hyperlink>
+    </w:p>
+    <w:p>
+      <w:pPr>
+        <w:tabs>
+          <w:tab w:val="right" w:leader="dot" w:pos="9350"/>
+        </w:tabs>
+        <w:spacing w:before="0" w:after="60" w:line="276" w:lineRule="auto"/>
+        <w:ind w:left="440"/>
+        <w:jc w:val="left"/>
+      </w:pPr>
+      <w:hyperlink w:anchor="_Toc800207" w:history="1">
+        <w:r>
+          <w:rPr>
+            <w:rFonts w:ascii="Times New Roman" w:hAnsi="Times New Roman" w:cs="Times New Roman"/>
+            <w:sz w:val="24"/>
+            <w:szCs w:val="24"/>
+            <w:lang w:val="es-GT"/>
+          </w:rPr>
+          <w:t xml:space="preserve">Árbol de objetivos</w:t>
+        </w:r>
+        <w:r>
+          <w:rPr>
+            <w:rFonts w:ascii="Times New Roman" w:hAnsi="Times New Roman" w:cs="Times New Roman"/>
+            <w:sz w:val="24"/>
+            <w:szCs w:val="24"/>
+            <w:lang w:val="es-GT"/>
+          </w:rPr>
+          <w:tab/>
+        </w:r>
+        <w:r>
+          <w:rPr>
+            <w:rFonts w:ascii="Times New Roman" w:hAnsi="Times New Roman" w:cs="Times New Roman"/>
+            <w:sz w:val="24"/>
+            <w:szCs w:val="24"/>
+            <w:lang w:val="es-GT"/>
+          </w:rPr>
+          <w:fldChar w:fldCharType="begin"/>
+        </w:r>
+        <w:r>
+          <w:rPr>
+            <w:rFonts w:ascii="Times New Roman" w:hAnsi="Times New Roman" w:cs="Times New Roman"/>
+            <w:sz w:val="24"/>
+            <w:szCs w:val="24"/>
+            <w:lang w:val="es-GT"/>
+          </w:rPr>
+          <w:instrText xml:space="preserve"> PAGEREF _Toc800207 \h </w:instrText>
+        </w:r>
+        <w:r>
+          <w:rPr>
+            <w:rFonts w:ascii="Times New Roman" w:hAnsi="Times New Roman" w:cs="Times New Roman"/>
+            <w:sz w:val="24"/>
+            <w:szCs w:val="24"/>
+            <w:lang w:val="es-GT"/>
+          </w:rPr>
+          <w:fldChar w:fldCharType="separate"/>
+        </w:r>
+        <w:r>
+          <w:rPr>
+            <w:rFonts w:ascii="Times New Roman" w:hAnsi="Times New Roman" w:cs="Times New Roman"/>
+            <w:sz w:val="24"/>
+            <w:szCs w:val="24"/>
+            <w:lang w:val="es-GT"/>
+          </w:rPr>
+          <w:t>5</w:t>
+        </w:r>
+        <w:r>
+          <w:rPr>
+            <w:rFonts w:ascii="Times New Roman" w:hAnsi="Times New Roman" w:cs="Times New Roman"/>
+            <w:sz w:val="24"/>
+            <w:szCs w:val="24"/>
+            <w:lang w:val="es-GT"/>
+          </w:rPr>
+          <w:fldChar w:fldCharType="end"/>
+        </w:r>
+      </w:hyperlink>
+    </w:p>
+    <w:p>
+      <w:pPr>
+        <w:tabs>
+          <w:tab w:val="right" w:leader="dot" w:pos="9350"/>
+        </w:tabs>
+        <w:spacing w:before="0" w:after="60" w:line="276" w:lineRule="auto"/>
+        <w:ind w:left="440"/>
+        <w:jc w:val="left"/>
+      </w:pPr>
+      <w:hyperlink w:anchor="_Toc800208" w:history="1">
+        <w:r>
+          <w:rPr>
+            <w:rFonts w:ascii="Times New Roman" w:hAnsi="Times New Roman" w:cs="Times New Roman"/>
+            <w:sz w:val="24"/>
+            <w:szCs w:val="24"/>
+            <w:lang w:val="es-GT"/>
+          </w:rPr>
+          <w:t xml:space="preserve">Pregunta de investigación</w:t>
+        </w:r>
+        <w:r>
+          <w:rPr>
+            <w:rFonts w:ascii="Times New Roman" w:hAnsi="Times New Roman" w:cs="Times New Roman"/>
+            <w:sz w:val="24"/>
+            <w:szCs w:val="24"/>
+            <w:lang w:val="es-GT"/>
+          </w:rPr>
+          <w:tab/>
+        </w:r>
+        <w:r>
+          <w:rPr>
+            <w:rFonts w:ascii="Times New Roman" w:hAnsi="Times New Roman" w:cs="Times New Roman"/>
+            <w:sz w:val="24"/>
+            <w:szCs w:val="24"/>
+            <w:lang w:val="es-GT"/>
+          </w:rPr>
+          <w:fldChar w:fldCharType="begin"/>
+        </w:r>
+        <w:r>
+          <w:rPr>
+            <w:rFonts w:ascii="Times New Roman" w:hAnsi="Times New Roman" w:cs="Times New Roman"/>
+            <w:sz w:val="24"/>
+            <w:szCs w:val="24"/>
+            <w:lang w:val="es-GT"/>
+          </w:rPr>
+          <w:instrText xml:space="preserve"> PAGEREF _Toc800208 \h </w:instrText>
+        </w:r>
+        <w:r>
+          <w:rPr>
+            <w:rFonts w:ascii="Times New Roman" w:hAnsi="Times New Roman" w:cs="Times New Roman"/>
+            <w:sz w:val="24"/>
+            <w:szCs w:val="24"/>
+            <w:lang w:val="es-GT"/>
+          </w:rPr>
+          <w:fldChar w:fldCharType="separate"/>
+        </w:r>
+        <w:r>
+          <w:rPr>
+            <w:rFonts w:ascii="Times New Roman" w:hAnsi="Times New Roman" w:cs="Times New Roman"/>
+            <w:sz w:val="24"/>
+            <w:szCs w:val="24"/>
+            <w:lang w:val="es-GT"/>
+          </w:rPr>
+          <w:t>6</w:t>
+        </w:r>
+        <w:r>
+          <w:rPr>
+            <w:rFonts w:ascii="Times New Roman" w:hAnsi="Times New Roman" w:cs="Times New Roman"/>
+            <w:sz w:val="24"/>
+            <w:szCs w:val="24"/>
+            <w:lang w:val="es-GT"/>
+          </w:rPr>
+          <w:fldChar w:fldCharType="end"/>
+        </w:r>
+      </w:hyperlink>
+    </w:p>
+    <w:p>
+      <w:pPr>
+        <w:tabs>
+          <w:tab w:val="right" w:leader="dot" w:pos="9350"/>
+        </w:tabs>
+        <w:spacing w:before="0" w:after="60" w:line="276" w:lineRule="auto"/>
+        <w:jc w:val="left"/>
+      </w:pPr>
+      <w:hyperlink w:anchor="_Toc800209" w:history="1">
+        <w:r>
+          <w:rPr>
+            <w:rFonts w:ascii="Times New Roman" w:hAnsi="Times New Roman" w:cs="Times New Roman"/>
+            <w:b/>
+            <w:sz w:val="24"/>
+            <w:szCs w:val="24"/>
+            <w:lang w:val="es-GT"/>
+          </w:rPr>
+          <w:t xml:space="preserve">Objetivos</w:t>
+        </w:r>
+        <w:r>
+          <w:rPr>
+            <w:rFonts w:ascii="Times New Roman" w:hAnsi="Times New Roman" w:cs="Times New Roman"/>
+            <w:b/>
+            <w:sz w:val="24"/>
+            <w:szCs w:val="24"/>
+            <w:lang w:val="es-GT"/>
+          </w:rPr>
+          <w:tab/>
+        </w:r>
+        <w:r>
+          <w:rPr>
+            <w:rFonts w:ascii="Times New Roman" w:hAnsi="Times New Roman" w:cs="Times New Roman"/>
+            <w:b/>
+            <w:sz w:val="24"/>
+            <w:szCs w:val="24"/>
+            <w:lang w:val="es-GT"/>
+          </w:rPr>
+          <w:fldChar w:fldCharType="begin"/>
+        </w:r>
+        <w:r>
+          <w:rPr>
+            <w:rFonts w:ascii="Times New Roman" w:hAnsi="Times New Roman" w:cs="Times New Roman"/>
+            <w:b/>
+            <w:sz w:val="24"/>
+            <w:szCs w:val="24"/>
+            <w:lang w:val="es-GT"/>
+          </w:rPr>
+          <w:instrText xml:space="preserve"> PAGEREF _Toc800209 \h </w:instrText>
+        </w:r>
+        <w:r>
+          <w:rPr>
+            <w:rFonts w:ascii="Times New Roman" w:hAnsi="Times New Roman" w:cs="Times New Roman"/>
+            <w:b/>
+            <w:sz w:val="24"/>
+            <w:szCs w:val="24"/>
+            <w:lang w:val="es-GT"/>
+          </w:rPr>
+          <w:fldChar w:fldCharType="separate"/>
+        </w:r>
+        <w:r>
+          <w:rPr>
+            <w:rFonts w:ascii="Times New Roman" w:hAnsi="Times New Roman" w:cs="Times New Roman"/>
+            <w:b/>
+            <w:sz w:val="24"/>
+            <w:szCs w:val="24"/>
+            <w:lang w:val="es-GT"/>
+          </w:rPr>
+          <w:t>7</w:t>
+        </w:r>
+        <w:r>
+          <w:rPr>
+            <w:rFonts w:ascii="Times New Roman" w:hAnsi="Times New Roman" w:cs="Times New Roman"/>
+            <w:b/>
+            <w:sz w:val="24"/>
+            <w:szCs w:val="24"/>
+            <w:lang w:val="es-GT"/>
+          </w:rPr>
+          <w:fldChar w:fldCharType="end"/>
+        </w:r>
+      </w:hyperlink>
+    </w:p>
+    <w:p>
+      <w:pPr>
+        <w:tabs>
+          <w:tab w:val="right" w:leader="dot" w:pos="9350"/>
+        </w:tabs>
+        <w:spacing w:before="0" w:after="60" w:line="276" w:lineRule="auto"/>
+        <w:ind w:left="440"/>
+        <w:jc w:val="left"/>
+      </w:pPr>
+      <w:hyperlink w:anchor="_Toc800210" w:history="1">
+        <w:r>
+          <w:rPr>
+            <w:rFonts w:ascii="Times New Roman" w:hAnsi="Times New Roman" w:cs="Times New Roman"/>
+            <w:sz w:val="24"/>
+            <w:szCs w:val="24"/>
+            <w:lang w:val="es-GT"/>
+          </w:rPr>
+          <w:t xml:space="preserve">Objetivo general</w:t>
+        </w:r>
+        <w:r>
+          <w:rPr>
+            <w:rFonts w:ascii="Times New Roman" w:hAnsi="Times New Roman" w:cs="Times New Roman"/>
+            <w:sz w:val="24"/>
+            <w:szCs w:val="24"/>
+            <w:lang w:val="es-GT"/>
+          </w:rPr>
+          <w:tab/>
+        </w:r>
+        <w:r>
+          <w:rPr>
+            <w:rFonts w:ascii="Times New Roman" w:hAnsi="Times New Roman" w:cs="Times New Roman"/>
+            <w:sz w:val="24"/>
+            <w:szCs w:val="24"/>
+            <w:lang w:val="es-GT"/>
+          </w:rPr>
+          <w:fldChar w:fldCharType="begin"/>
+        </w:r>
+        <w:r>
+          <w:rPr>
+            <w:rFonts w:ascii="Times New Roman" w:hAnsi="Times New Roman" w:cs="Times New Roman"/>
+            <w:sz w:val="24"/>
+            <w:szCs w:val="24"/>
+            <w:lang w:val="es-GT"/>
+          </w:rPr>
+          <w:instrText xml:space="preserve"> PAGEREF _Toc800210 \h </w:instrText>
+        </w:r>
+        <w:r>
+          <w:rPr>
+            <w:rFonts w:ascii="Times New Roman" w:hAnsi="Times New Roman" w:cs="Times New Roman"/>
+            <w:sz w:val="24"/>
+            <w:szCs w:val="24"/>
+            <w:lang w:val="es-GT"/>
+          </w:rPr>
+          <w:fldChar w:fldCharType="separate"/>
+        </w:r>
+        <w:r>
+          <w:rPr>
+            <w:rFonts w:ascii="Times New Roman" w:hAnsi="Times New Roman" w:cs="Times New Roman"/>
+            <w:sz w:val="24"/>
+            <w:szCs w:val="24"/>
+            <w:lang w:val="es-GT"/>
+          </w:rPr>
+          <w:t>7</w:t>
+        </w:r>
+        <w:r>
+          <w:rPr>
+            <w:rFonts w:ascii="Times New Roman" w:hAnsi="Times New Roman" w:cs="Times New Roman"/>
+            <w:sz w:val="24"/>
+            <w:szCs w:val="24"/>
+            <w:lang w:val="es-GT"/>
+          </w:rPr>
+          <w:fldChar w:fldCharType="end"/>
+        </w:r>
+      </w:hyperlink>
+    </w:p>
+    <w:p>
+      <w:pPr>
+        <w:tabs>
+          <w:tab w:val="right" w:leader="dot" w:pos="9350"/>
+        </w:tabs>
+        <w:spacing w:before="0" w:after="60" w:line="276" w:lineRule="auto"/>
+        <w:ind w:left="440"/>
+        <w:jc w:val="left"/>
+      </w:pPr>
+      <w:hyperlink w:anchor="_Toc800211" w:history="1">
+        <w:r>
+          <w:rPr>
+            <w:rFonts w:ascii="Times New Roman" w:hAnsi="Times New Roman" w:cs="Times New Roman"/>
+            <w:sz w:val="24"/>
+            <w:szCs w:val="24"/>
+            <w:lang w:val="es-GT"/>
+          </w:rPr>
+          <w:t xml:space="preserve">Objetivos específicos</w:t>
+        </w:r>
+        <w:r>
+          <w:rPr>
+            <w:rFonts w:ascii="Times New Roman" w:hAnsi="Times New Roman" w:cs="Times New Roman"/>
+            <w:sz w:val="24"/>
+            <w:szCs w:val="24"/>
+            <w:lang w:val="es-GT"/>
+          </w:rPr>
+          <w:tab/>
+        </w:r>
+        <w:r>
+          <w:rPr>
+            <w:rFonts w:ascii="Times New Roman" w:hAnsi="Times New Roman" w:cs="Times New Roman"/>
+            <w:sz w:val="24"/>
+            <w:szCs w:val="24"/>
+            <w:lang w:val="es-GT"/>
+          </w:rPr>
+          <w:fldChar w:fldCharType="begin"/>
+        </w:r>
+        <w:r>
+          <w:rPr>
+            <w:rFonts w:ascii="Times New Roman" w:hAnsi="Times New Roman" w:cs="Times New Roman"/>
+            <w:sz w:val="24"/>
+            <w:szCs w:val="24"/>
+            <w:lang w:val="es-GT"/>
+          </w:rPr>
+          <w:instrText xml:space="preserve"> PAGEREF _Toc800211 \h </w:instrText>
+        </w:r>
+        <w:r>
+          <w:rPr>
+            <w:rFonts w:ascii="Times New Roman" w:hAnsi="Times New Roman" w:cs="Times New Roman"/>
+            <w:sz w:val="24"/>
+            <w:szCs w:val="24"/>
+            <w:lang w:val="es-GT"/>
+          </w:rPr>
+          <w:fldChar w:fldCharType="separate"/>
+        </w:r>
+        <w:r>
+          <w:rPr>
+            <w:rFonts w:ascii="Times New Roman" w:hAnsi="Times New Roman" w:cs="Times New Roman"/>
+            <w:sz w:val="24"/>
+            <w:szCs w:val="24"/>
+            <w:lang w:val="es-GT"/>
+          </w:rPr>
+          <w:t>7</w:t>
+        </w:r>
+        <w:r>
+          <w:rPr>
+            <w:rFonts w:ascii="Times New Roman" w:hAnsi="Times New Roman" w:cs="Times New Roman"/>
+            <w:sz w:val="24"/>
+            <w:szCs w:val="24"/>
+            <w:lang w:val="es-GT"/>
+          </w:rPr>
+          <w:fldChar w:fldCharType="end"/>
+        </w:r>
+      </w:hyperlink>
+    </w:p>
+    <w:p>
+      <w:pPr>
+        <w:tabs>
+          <w:tab w:val="right" w:leader="dot" w:pos="9350"/>
+        </w:tabs>
+        <w:spacing w:before="0" w:after="60" w:line="276" w:lineRule="auto"/>
+        <w:jc w:val="left"/>
+      </w:pPr>
+      <w:hyperlink w:anchor="_Toc800212" w:history="1">
+        <w:r>
+          <w:rPr>
+            <w:rFonts w:ascii="Times New Roman" w:hAnsi="Times New Roman" w:cs="Times New Roman"/>
+            <w:b/>
+            <w:sz w:val="24"/>
+            <w:szCs w:val="24"/>
+            <w:lang w:val="es-GT"/>
+          </w:rPr>
+          <w:t xml:space="preserve">Alcances y límites</w:t>
+        </w:r>
+        <w:r>
+          <w:rPr>
+            <w:rFonts w:ascii="Times New Roman" w:hAnsi="Times New Roman" w:cs="Times New Roman"/>
+            <w:b/>
+            <w:sz w:val="24"/>
+            <w:szCs w:val="24"/>
+            <w:lang w:val="es-GT"/>
+          </w:rPr>
+          <w:tab/>
+        </w:r>
+        <w:r>
+          <w:rPr>
+            <w:rFonts w:ascii="Times New Roman" w:hAnsi="Times New Roman" w:cs="Times New Roman"/>
+            <w:b/>
+            <w:sz w:val="24"/>
+            <w:szCs w:val="24"/>
+            <w:lang w:val="es-GT"/>
+          </w:rPr>
+          <w:fldChar w:fldCharType="begin"/>
+        </w:r>
+        <w:r>
+          <w:rPr>
+            <w:rFonts w:ascii="Times New Roman" w:hAnsi="Times New Roman" w:cs="Times New Roman"/>
+            <w:b/>
+            <w:sz w:val="24"/>
+            <w:szCs w:val="24"/>
+            <w:lang w:val="es-GT"/>
+          </w:rPr>
+          <w:instrText xml:space="preserve"> PAGEREF _Toc800212 \h </w:instrText>
+        </w:r>
+        <w:r>
+          <w:rPr>
+            <w:rFonts w:ascii="Times New Roman" w:hAnsi="Times New Roman" w:cs="Times New Roman"/>
+            <w:b/>
+            <w:sz w:val="24"/>
+            <w:szCs w:val="24"/>
+            <w:lang w:val="es-GT"/>
+          </w:rPr>
+          <w:fldChar w:fldCharType="separate"/>
+        </w:r>
+        <w:r>
+          <w:rPr>
+            <w:rFonts w:ascii="Times New Roman" w:hAnsi="Times New Roman" w:cs="Times New Roman"/>
+            <w:b/>
+            <w:sz w:val="24"/>
+            <w:szCs w:val="24"/>
+            <w:lang w:val="es-GT"/>
+          </w:rPr>
+          <w:t>7</w:t>
+        </w:r>
+        <w:r>
+          <w:rPr>
+            <w:rFonts w:ascii="Times New Roman" w:hAnsi="Times New Roman" w:cs="Times New Roman"/>
+            <w:b/>
+            <w:sz w:val="24"/>
+            <w:szCs w:val="24"/>
+            <w:lang w:val="es-GT"/>
+          </w:rPr>
+          <w:fldChar w:fldCharType="end"/>
+        </w:r>
+      </w:hyperlink>
+    </w:p>
+    <w:p>
+      <w:pPr>
+        <w:tabs>
+          <w:tab w:val="right" w:leader="dot" w:pos="9350"/>
+        </w:tabs>
+        <w:spacing w:before="0" w:after="60" w:line="276" w:lineRule="auto"/>
+        <w:jc w:val="left"/>
+      </w:pPr>
+      <w:hyperlink w:anchor="_Toc800213" w:history="1">
+        <w:r>
+          <w:rPr>
+            <w:rFonts w:ascii="Times New Roman" w:hAnsi="Times New Roman" w:cs="Times New Roman"/>
+            <w:b/>
+            <w:sz w:val="24"/>
+            <w:szCs w:val="24"/>
+            <w:lang w:val="es-GT"/>
+          </w:rPr>
+          <w:t xml:space="preserve">Justificación</w:t>
+        </w:r>
+        <w:r>
+          <w:rPr>
+            <w:rFonts w:ascii="Times New Roman" w:hAnsi="Times New Roman" w:cs="Times New Roman"/>
+            <w:b/>
+            <w:sz w:val="24"/>
+            <w:szCs w:val="24"/>
+            <w:lang w:val="es-GT"/>
+          </w:rPr>
+          <w:tab/>
+        </w:r>
+        <w:r>
+          <w:rPr>
+            <w:rFonts w:ascii="Times New Roman" w:hAnsi="Times New Roman" w:cs="Times New Roman"/>
+            <w:b/>
+            <w:sz w:val="24"/>
+            <w:szCs w:val="24"/>
+            <w:lang w:val="es-GT"/>
+          </w:rPr>
+          <w:fldChar w:fldCharType="begin"/>
+        </w:r>
+        <w:r>
+          <w:rPr>
+            <w:rFonts w:ascii="Times New Roman" w:hAnsi="Times New Roman" w:cs="Times New Roman"/>
+            <w:b/>
+            <w:sz w:val="24"/>
+            <w:szCs w:val="24"/>
+            <w:lang w:val="es-GT"/>
+          </w:rPr>
+          <w:instrText xml:space="preserve"> PAGEREF _Toc800213 \h </w:instrText>
+        </w:r>
+        <w:r>
+          <w:rPr>
+            <w:rFonts w:ascii="Times New Roman" w:hAnsi="Times New Roman" w:cs="Times New Roman"/>
+            <w:b/>
+            <w:sz w:val="24"/>
+            <w:szCs w:val="24"/>
+            <w:lang w:val="es-GT"/>
+          </w:rPr>
+          <w:fldChar w:fldCharType="separate"/>
+        </w:r>
+        <w:r>
+          <w:rPr>
+            <w:rFonts w:ascii="Times New Roman" w:hAnsi="Times New Roman" w:cs="Times New Roman"/>
+            <w:b/>
+            <w:sz w:val="24"/>
+            <w:szCs w:val="24"/>
+            <w:lang w:val="es-GT"/>
+          </w:rPr>
+          <w:t>8</w:t>
+        </w:r>
+        <w:r>
+          <w:rPr>
+            <w:rFonts w:ascii="Times New Roman" w:hAnsi="Times New Roman" w:cs="Times New Roman"/>
+            <w:b/>
+            <w:sz w:val="24"/>
+            <w:szCs w:val="24"/>
+            <w:lang w:val="es-GT"/>
+          </w:rPr>
+          <w:fldChar w:fldCharType="end"/>
+        </w:r>
+      </w:hyperlink>
+    </w:p>
+    <w:p>
+      <w:pPr>
+        <w:tabs>
+          <w:tab w:val="right" w:leader="dot" w:pos="9350"/>
+        </w:tabs>
+        <w:spacing w:before="0" w:after="60" w:line="276" w:lineRule="auto"/>
+        <w:jc w:val="left"/>
+      </w:pPr>
+      <w:hyperlink w:anchor="_Toc800214" w:history="1">
+        <w:r>
+          <w:rPr>
+            <w:rFonts w:ascii="Times New Roman" w:hAnsi="Times New Roman" w:cs="Times New Roman"/>
+            <w:b/>
+            <w:sz w:val="24"/>
+            <w:szCs w:val="24"/>
+            <w:lang w:val="es-GT"/>
+          </w:rPr>
+          <w:t xml:space="preserve">Viabilidad técnica y científica</w:t>
+        </w:r>
+        <w:r>
+          <w:rPr>
+            <w:rFonts w:ascii="Times New Roman" w:hAnsi="Times New Roman" w:cs="Times New Roman"/>
+            <w:b/>
+            <w:sz w:val="24"/>
+            <w:szCs w:val="24"/>
+            <w:lang w:val="es-GT"/>
+          </w:rPr>
+          <w:tab/>
+        </w:r>
+        <w:r>
+          <w:rPr>
+            <w:rFonts w:ascii="Times New Roman" w:hAnsi="Times New Roman" w:cs="Times New Roman"/>
+            <w:b/>
+            <w:sz w:val="24"/>
+            <w:szCs w:val="24"/>
+            <w:lang w:val="es-GT"/>
+          </w:rPr>
+          <w:fldChar w:fldCharType="begin"/>
+        </w:r>
+        <w:r>
+          <w:rPr>
+            <w:rFonts w:ascii="Times New Roman" w:hAnsi="Times New Roman" w:cs="Times New Roman"/>
+            <w:b/>
+            <w:sz w:val="24"/>
+            <w:szCs w:val="24"/>
+            <w:lang w:val="es-GT"/>
+          </w:rPr>
+          <w:instrText xml:space="preserve"> PAGEREF _Toc800214 \h </w:instrText>
+        </w:r>
+        <w:r>
+          <w:rPr>
+            <w:rFonts w:ascii="Times New Roman" w:hAnsi="Times New Roman" w:cs="Times New Roman"/>
+            <w:b/>
+            <w:sz w:val="24"/>
+            <w:szCs w:val="24"/>
+            <w:lang w:val="es-GT"/>
+          </w:rPr>
+          <w:fldChar w:fldCharType="separate"/>
+        </w:r>
+        <w:r>
+          <w:rPr>
+            <w:rFonts w:ascii="Times New Roman" w:hAnsi="Times New Roman" w:cs="Times New Roman"/>
+            <w:b/>
+            <w:sz w:val="24"/>
+            <w:szCs w:val="24"/>
+            <w:lang w:val="es-GT"/>
+          </w:rPr>
+          <w:t>9</w:t>
+        </w:r>
+        <w:r>
+          <w:rPr>
+            <w:rFonts w:ascii="Times New Roman" w:hAnsi="Times New Roman" w:cs="Times New Roman"/>
+            <w:b/>
+            <w:sz w:val="24"/>
+            <w:szCs w:val="24"/>
+            <w:lang w:val="es-GT"/>
+          </w:rPr>
+          <w:fldChar w:fldCharType="end"/>
+        </w:r>
+      </w:hyperlink>
+    </w:p>
+    <w:p>
+      <w:pPr>
+        <w:tabs>
+          <w:tab w:val="right" w:leader="dot" w:pos="9350"/>
+        </w:tabs>
+        <w:spacing w:before="0" w:after="60" w:line="276" w:lineRule="auto"/>
+        <w:jc w:val="left"/>
+      </w:pPr>
+      <w:hyperlink w:anchor="_Toc800215" w:history="1">
+        <w:r>
+          <w:rPr>
+            <w:rFonts w:ascii="Times New Roman" w:hAnsi="Times New Roman" w:cs="Times New Roman"/>
+            <w:b/>
+            <w:sz w:val="24"/>
+            <w:szCs w:val="24"/>
+            <w:lang w:val="es-GT"/>
+          </w:rPr>
+          <w:t xml:space="preserve">Referencias</w:t>
+        </w:r>
+        <w:r>
+          <w:rPr>
+            <w:rFonts w:ascii="Times New Roman" w:hAnsi="Times New Roman" w:cs="Times New Roman"/>
+            <w:b/>
+            <w:sz w:val="24"/>
+            <w:szCs w:val="24"/>
+            <w:lang w:val="es-GT"/>
+          </w:rPr>
+          <w:tab/>
+        </w:r>
+        <w:r>
+          <w:rPr>
+            <w:rFonts w:ascii="Times New Roman" w:hAnsi="Times New Roman" w:cs="Times New Roman"/>
+            <w:b/>
+            <w:sz w:val="24"/>
+            <w:szCs w:val="24"/>
+            <w:lang w:val="es-GT"/>
+          </w:rPr>
+          <w:fldChar w:fldCharType="begin"/>
+        </w:r>
+        <w:r>
+          <w:rPr>
+            <w:rFonts w:ascii="Times New Roman" w:hAnsi="Times New Roman" w:cs="Times New Roman"/>
+            <w:b/>
+            <w:sz w:val="24"/>
+            <w:szCs w:val="24"/>
+            <w:lang w:val="es-GT"/>
+          </w:rPr>
+          <w:instrText xml:space="preserve"> PAGEREF _Toc800215 \h </w:instrText>
+        </w:r>
+        <w:r>
+          <w:rPr>
+            <w:rFonts w:ascii="Times New Roman" w:hAnsi="Times New Roman" w:cs="Times New Roman"/>
+            <w:b/>
+            <w:sz w:val="24"/>
+            <w:szCs w:val="24"/>
+            <w:lang w:val="es-GT"/>
+          </w:rPr>
+          <w:fldChar w:fldCharType="separate"/>
+        </w:r>
+        <w:r>
+          <w:rPr>
+            <w:rFonts w:ascii="Times New Roman" w:hAnsi="Times New Roman" w:cs="Times New Roman"/>
+            <w:b/>
+            <w:sz w:val="24"/>
+            <w:szCs w:val="24"/>
+            <w:lang w:val="es-GT"/>
+          </w:rPr>
+          <w:t>11</w:t>
+        </w:r>
+        <w:r>
+          <w:rPr>
+            <w:rFonts w:ascii="Times New Roman" w:hAnsi="Times New Roman" w:cs="Times New Roman"/>
+            <w:b/>
+            <w:sz w:val="24"/>
+            <w:szCs w:val="24"/>
+            <w:lang w:val="es-GT"/>
+          </w:rPr>
+          <w:fldChar w:fldCharType="end"/>
+        </w:r>
+      </w:hyperlink>
+      <w:r>
+        <w:fldChar w:fldCharType="end"/>
+      </w:r>
+    </w:p>
+    <w:p>
+      <w:pPr>
+        <w:sectPr>
+          <w:headerReference w:type="default" r:id="rIdHdrDef"/>
+          <w:pgSz w:w="12240" w:h="15840"/>
+          <w:pgMar w:top="1440" w:right="1440" w:bottom="1440" w:left="1440" w:header="720" w:footer="720" w:gutter="0"/>
+          <w:pgNumType w:fmt="lowerRoman" w:start="2"/>
+          <w:cols w:space="720"/>
+          <w:docGrid w:linePitch="360"/>
+        </w:sectPr>
+      </w:pPr>
+    </w:p>
+    <w:p>
+      <w:pPr>
         <w:keepNext/>
-        <w:pageBreakBefore/>
         <w:spacing w:before="240" w:after="0" w:line="360" w:lineRule="auto"/>
         <w:jc w:val="center"/>
         <w:outlineLvl w:val="0"/>
@@ -692,6 +1906,7 @@
           <w:lang w:val="es-GT"/>
         </w:rPr>
       </w:pPr>
+      <w:bookmarkStart w:id="201" w:name="_Toc800201"/>
       <w:r>
         <w:rPr>
           <w:rFonts w:ascii="Times New Roman" w:hAnsi="Times New Roman" w:cs="Times New Roman"/>
@@ -700,8 +1915,9 @@
           <w:szCs w:val="24"/>
           <w:lang w:val="es-GT"/>
         </w:rPr>
-        <w:t xml:space="preserve">Planteamiento del problema</w:t>
-      </w:r>
+        <w:t xml:space="preserve">Planteamiento y formulación del problema</w:t>
+      </w:r>
+      <w:bookmarkEnd w:id="201"/>
     </w:p>
     <w:p>
       <w:pPr>
@@ -714,6 +1930,7 @@
           <w:lang w:val="es-GT"/>
         </w:rPr>
       </w:pPr>
+      <w:bookmarkStart w:id="202" w:name="_Toc800202"/>
       <w:r>
         <w:rPr>
           <w:rFonts w:ascii="Times New Roman" w:hAnsi="Times New Roman" w:cs="Times New Roman"/>
@@ -724,6 +1941,7 @@
         </w:rPr>
         <w:t xml:space="preserve">Contexto y situación actual</w:t>
       </w:r>
+      <w:bookmarkEnd w:id="202"/>
     </w:p>
     <w:p>
       <w:pPr>
@@ -796,6 +2014,7 @@
           <w:lang w:val="es-GT"/>
         </w:rPr>
       </w:pPr>
+      <w:bookmarkStart w:id="203" w:name="_Toc800203"/>
       <w:r>
         <w:rPr>
           <w:rFonts w:ascii="Times New Roman" w:hAnsi="Times New Roman" w:cs="Times New Roman"/>
@@ -806,6 +2025,7 @@
         </w:rPr>
         <w:t xml:space="preserve">Planteamiento del problema</w:t>
       </w:r>
+      <w:bookmarkEnd w:id="203"/>
     </w:p>
     <w:p>
       <w:pPr>
@@ -878,6 +2098,7 @@
           <w:lang w:val="es-GT"/>
         </w:rPr>
       </w:pPr>
+      <w:bookmarkStart w:id="204" w:name="_Toc800204"/>
       <w:r>
         <w:rPr>
           <w:rFonts w:ascii="Times New Roman" w:hAnsi="Times New Roman" w:cs="Times New Roman"/>
@@ -888,6 +2109,7 @@
         </w:rPr>
         <w:t xml:space="preserve">Propósito del estudio</w:t>
       </w:r>
+      <w:bookmarkEnd w:id="204"/>
     </w:p>
     <w:p>
       <w:pPr>
@@ -920,6 +2142,7 @@
           <w:lang w:val="es-GT"/>
         </w:rPr>
       </w:pPr>
+      <w:bookmarkStart w:id="205" w:name="_Toc800205"/>
       <w:r>
         <w:rPr>
           <w:rFonts w:ascii="Times New Roman" w:hAnsi="Times New Roman" w:cs="Times New Roman"/>
@@ -930,6 +2153,7 @@
         </w:rPr>
         <w:t xml:space="preserve">Deficiencias en el conocimiento</w:t>
       </w:r>
+      <w:bookmarkEnd w:id="205"/>
     </w:p>
     <w:p>
       <w:pPr>
@@ -962,6 +2186,7 @@
           <w:lang w:val="es-GT"/>
         </w:rPr>
       </w:pPr>
+      <w:bookmarkStart w:id="206" w:name="_Toc800206"/>
       <w:r>
         <w:rPr>
           <w:rFonts w:ascii="Times New Roman" w:hAnsi="Times New Roman" w:cs="Times New Roman"/>
@@ -972,6 +2197,7 @@
         </w:rPr>
         <w:t xml:space="preserve">Árbol de problemas</w:t>
       </w:r>
+      <w:bookmarkEnd w:id="206"/>
     </w:p>
     <w:p>
       <w:pPr>
@@ -1996,6 +3222,7 @@
           <w:lang w:val="es-GT"/>
         </w:rPr>
       </w:pPr>
+      <w:bookmarkStart w:id="207" w:name="_Toc800207"/>
       <w:r>
         <w:rPr>
           <w:rFonts w:ascii="Times New Roman" w:hAnsi="Times New Roman" w:cs="Times New Roman"/>
@@ -2006,6 +3233,7 @@
         </w:rPr>
         <w:t xml:space="preserve">Árbol de objetivos</w:t>
       </w:r>
+      <w:bookmarkEnd w:id="207"/>
     </w:p>
     <w:p>
       <w:pPr>
@@ -2152,6 +3380,7 @@
           <w:lang w:val="es-GT"/>
         </w:rPr>
       </w:pPr>
+      <w:bookmarkStart w:id="208" w:name="_Toc800208"/>
       <w:r>
         <w:rPr>
           <w:rFonts w:ascii="Times New Roman" w:hAnsi="Times New Roman" w:cs="Times New Roman"/>
@@ -2162,6 +3391,7 @@
         </w:rPr>
         <w:t xml:space="preserve">Pregunta de investigación</w:t>
       </w:r>
+      <w:bookmarkEnd w:id="208"/>
     </w:p>
     <w:p>
       <w:pPr>
@@ -2748,6 +3978,7 @@
           <w:lang w:val="es-GT"/>
         </w:rPr>
       </w:pPr>
+      <w:bookmarkStart w:id="209" w:name="_Toc800209"/>
       <w:r>
         <w:rPr>
           <w:rFonts w:ascii="Times New Roman" w:hAnsi="Times New Roman" w:cs="Times New Roman"/>
@@ -2758,6 +3989,7 @@
         </w:rPr>
         <w:t xml:space="preserve">Objetivos</w:t>
       </w:r>
+      <w:bookmarkEnd w:id="209"/>
     </w:p>
     <w:p>
       <w:pPr>
@@ -2770,6 +4002,7 @@
           <w:lang w:val="es-GT"/>
         </w:rPr>
       </w:pPr>
+      <w:bookmarkStart w:id="210" w:name="_Toc800210"/>
       <w:r>
         <w:rPr>
           <w:rFonts w:ascii="Times New Roman" w:hAnsi="Times New Roman" w:cs="Times New Roman"/>
@@ -2780,6 +4013,7 @@
         </w:rPr>
         <w:t xml:space="preserve">Objetivo general</w:t>
       </w:r>
+      <w:bookmarkEnd w:id="210"/>
     </w:p>
     <w:p>
       <w:pPr>
@@ -2812,6 +4046,7 @@
           <w:lang w:val="es-GT"/>
         </w:rPr>
       </w:pPr>
+      <w:bookmarkStart w:id="211" w:name="_Toc800211"/>
       <w:r>
         <w:rPr>
           <w:rFonts w:ascii="Times New Roman" w:hAnsi="Times New Roman" w:cs="Times New Roman"/>
@@ -2822,6 +4057,7 @@
         </w:rPr>
         <w:t xml:space="preserve">Objetivos específicos</w:t>
       </w:r>
+      <w:bookmarkEnd w:id="211"/>
     </w:p>
     <w:p>
       <w:pPr>
@@ -2921,6 +4157,7 @@
           <w:lang w:val="es-GT"/>
         </w:rPr>
       </w:pPr>
+      <w:bookmarkStart w:id="212" w:name="_Toc800212"/>
       <w:r>
         <w:rPr>
           <w:rFonts w:ascii="Times New Roman" w:hAnsi="Times New Roman" w:cs="Times New Roman"/>
@@ -2931,6 +4168,7 @@
         </w:rPr>
         <w:t xml:space="preserve">Alcances y límites</w:t>
       </w:r>
+      <w:bookmarkEnd w:id="212"/>
     </w:p>
     <w:p>
       <w:pPr>
@@ -3327,6 +4565,7 @@
           <w:lang w:val="es-GT"/>
         </w:rPr>
       </w:pPr>
+      <w:bookmarkStart w:id="213" w:name="_Toc800213"/>
       <w:r>
         <w:rPr>
           <w:rFonts w:ascii="Times New Roman" w:hAnsi="Times New Roman" w:cs="Times New Roman"/>
@@ -3337,6 +4576,7 @@
         </w:rPr>
         <w:t xml:space="preserve">Justificación</w:t>
       </w:r>
+      <w:bookmarkEnd w:id="213"/>
     </w:p>
     <w:p>
       <w:pPr>
@@ -3449,6 +4689,7 @@
           <w:lang w:val="es-GT"/>
         </w:rPr>
       </w:pPr>
+      <w:bookmarkStart w:id="214" w:name="_Toc800214"/>
       <w:r>
         <w:rPr>
           <w:rFonts w:ascii="Times New Roman" w:hAnsi="Times New Roman" w:cs="Times New Roman"/>
@@ -3459,6 +4700,7 @@
         </w:rPr>
         <w:t xml:space="preserve">Viabilidad técnica y científica</w:t>
       </w:r>
+      <w:bookmarkEnd w:id="214"/>
     </w:p>
     <w:p>
       <w:pPr>
@@ -4236,6 +5478,7 @@
           <w:lang w:val="es-GT"/>
         </w:rPr>
       </w:pPr>
+      <w:bookmarkStart w:id="215" w:name="_Toc800215"/>
       <w:r>
         <w:rPr>
           <w:rFonts w:ascii="Times New Roman" w:hAnsi="Times New Roman" w:cs="Times New Roman"/>
@@ -4246,6 +5489,7 @@
         </w:rPr>
         <w:t xml:space="preserve">Referencias</w:t>
       </w:r>
+      <w:bookmarkEnd w:id="215"/>
     </w:p>
     <w:p>
       <w:pPr>
@@ -4678,11 +5922,10 @@
     </w:p>
     <w:sectPr>
       <w:headerReference w:type="default" r:id="rIdHdrDef"/>
-      <w:headerReference w:type="first" r:id="rIdHdrFirst"/>
       <w:pgSz w:w="12240" w:h="15840"/>
       <w:pgMar w:top="1440" w:right="1440" w:bottom="1440" w:left="1440" w:header="720" w:footer="720" w:gutter="0"/>
+      <w:pgNumType w:fmt="decimal" w:start="1"/>
       <w:cols w:space="720"/>
-      <w:titlePg/>
       <w:docGrid w:linePitch="360"/>
     </w:sectPr>
   </w:body>
@@ -4721,7 +5964,7 @@
         <w:rFonts w:ascii="Times New Roman" w:hAnsi="Times New Roman" w:cs="Times New Roman"/>
         <w:sz w:val="24"/>
       </w:rPr>
-      <w:t>2</w:t>
+      <w:t>1</w:t>
     </w:r>
     <w:r>
       <w:rPr>
@@ -4730,16 +5973,6 @@
       </w:rPr>
       <w:fldChar w:fldCharType="end"/>
     </w:r>
-  </w:p>
-</w:hdr>
-</file>
-
-<file path=word/headerFirst.xml><?xml version="1.0" encoding="utf-8"?>
-<w:hdr xmlns:w="http://schemas.openxmlformats.org/wordprocessingml/2006/main" xmlns:r="http://schemas.openxmlformats.org/officeDocument/2006/relationships">
-  <w:p>
-    <w:pPr>
-      <w:jc w:val="right"/>
-    </w:pPr>
   </w:p>
 </w:hdr>
 </file>

</xml_diff>